<commit_message>
update WMDR 2 build
</commit_message>
<xml_diff>
--- a/standard/wmdr2-DRAFT.docx
+++ b/standard/wmdr2-DRAFT.docx
@@ -45,7 +45,7 @@
         <w:pStyle w:val="Date"/>
       </w:pPr>
       <w:r>
-        <w:t xml:space="preserve">2026-01-22</w:t>
+        <w:t xml:space="preserve">2026-01-23</w:t>
       </w:r>
     </w:p>
     <w:p>
@@ -98,7 +98,7 @@
               <w:jc w:val="left"/>
             </w:pPr>
             <w:r>
-              <w:t xml:space="preserve">Date: 2026-01-22</w:t>
+              <w:t xml:space="preserve">Date: 2026-01-23</w:t>
             </w:r>
           </w:p>
         </w:tc>
@@ -250,7 +250,7 @@
               <w:jc w:val="left"/>
             </w:pPr>
             <w:r>
-              <w:t xml:space="preserve">Copyright © 2025 World Meteorological Organization (WMO)</w:t>
+              <w:t xml:space="preserve">Copyright © 2026 World Meteorological Organization (WMO)</w:t>
             </w:r>
           </w:p>
         </w:tc>

</xml_diff>